<commit_message>
Foundation inserts draft: Volume 2 assumption 4 reworded from "irrevocably corporate" to "Formation is never solitary" (John's ruling, 2026-09-05, after weighing the desert fathers and mothers). The scripture chain stands; two sentences added — solitude is a medium of formation and the desert proves how deep it goes; the desert also shows how thin a body can be and still be a body, one elder, a weekly table, and a rule, and never allowed the unwitnessed soul. Word copy rebuilt. Still an ask for the Council. DEV ONLY.
Co-Authored-By: Claude Fable 5.1 <noreply@anthropic.com>
</commit_message>
<xml_diff>
--- a/_implementation-notes/council-meeting-2026-09-06/IJH_Foundation_Inserts_DRAFT_2026-09-06_v1.docx
+++ b/_implementation-notes/council-meeting-2026-09-06/IJH_Foundation_Inserts_DRAFT_2026-09-06_v1.docx
@@ -338,13 +338,13 @@
           <w:b/>
           <w:bCs/>
         </w:rPr>
-        <w:t xml:space="preserve">4. Formation is irrevocably corporate.</w:t>
-      </w:r>
-      <w:r>
-        <w:t xml:space="preserve"> </w:t>
-      </w:r>
-      <w:r>
-        <w:t xml:space="preserve">The chain that produces faith needs someone sent, someone preaching, someone hearing (Rom. 10:14–17). Sins are confessed to one another (Jas. 5:16). The body grows by what every joint supplies (Eph. 4:15–16), gathers to stir one another up (Heb. 10:24–25), and discerns together what no member sees alone (Matt. 18:20; Acts 15:28). Work done alone has a ceiling and a danger: the ninth Exploration names the closed loop that turns private, then strange. The container is simply the community’s preparation to do this well.</w:t>
+        <w:t xml:space="preserve">4. Formation is never solitary.</w:t>
+      </w:r>
+      <w:r>
+        <w:t xml:space="preserve"> </w:t>
+      </w:r>
+      <w:r>
+        <w:t xml:space="preserve">The chain that produces faith needs someone sent, someone preaching, someone hearing (Rom. 10:14–17). Sins are confessed to one another (Jas. 5:16). The body grows by what every joint supplies (Eph. 4:15–16), gathers to stir one another up (Heb. 10:24–25), and discerns together what no member sees alone (Matt. 18:20; Acts 15:28). Solitude is a medium of formation, and the desert fathers and mothers prove how deep it can go; they also show how thin the body can be and still be a body: one elder, a weekly table, and a rule. What the desert never allowed was the unwitnessed soul, and its own cautionary tales are about the monk who consulted no one. Work done alone has a ceiling and a danger: the ninth Exploration names the closed loop that turns private, then strange. The container is simply the community’s preparation to do this well.</w:t>
       </w:r>
     </w:p>
     <w:p>

</xml_diff>